<commit_message>
Add editor-style code screenshots to Appendix A of the final report
</commit_message>
<xml_diff>
--- a/report/Mini_Project_Report_Multilingual_Summarizer.docx
+++ b/report/Mini_Project_Report_Multilingual_Summarizer.docx
@@ -1717,6 +1717,134 @@
                 <w:sz w:val="20"/>
               </w:rPr>
               <w:t>14</w:t>
+            </w:r>
+          </w:p>
+        </w:tc>
+      </w:tr>
+      <w:tr>
+        <w:tc>
+          <w:tcPr>
+            <w:tcW w:type="dxa" w:w="7654"/>
+          </w:tcPr>
+          <w:p>
+            <w:r/>
+            <w:r>
+              <w:rPr>
+                <w:rFonts w:ascii="Times New Roman" w:hAnsi="Times New Roman"/>
+                <w:sz w:val="20"/>
+              </w:rPr>
+              <w:t>Fig. A.1: Summarization function</w:t>
+            </w:r>
+          </w:p>
+        </w:tc>
+        <w:tc>
+          <w:tcPr>
+            <w:tcW w:type="dxa" w:w="1701"/>
+          </w:tcPr>
+          <w:p>
+            <w:r/>
+            <w:r>
+              <w:rPr>
+                <w:rFonts w:ascii="Times New Roman" w:hAnsi="Times New Roman"/>
+                <w:sz w:val="20"/>
+              </w:rPr>
+              <w:t>20</w:t>
+            </w:r>
+          </w:p>
+        </w:tc>
+      </w:tr>
+      <w:tr>
+        <w:tc>
+          <w:tcPr>
+            <w:tcW w:type="dxa" w:w="7654"/>
+          </w:tcPr>
+          <w:p>
+            <w:r/>
+            <w:r>
+              <w:rPr>
+                <w:rFonts w:ascii="Times New Roman" w:hAnsi="Times New Roman"/>
+                <w:sz w:val="20"/>
+              </w:rPr>
+              <w:t>Fig. A.2: OCR routing</w:t>
+            </w:r>
+          </w:p>
+        </w:tc>
+        <w:tc>
+          <w:tcPr>
+            <w:tcW w:type="dxa" w:w="1701"/>
+          </w:tcPr>
+          <w:p>
+            <w:r/>
+            <w:r>
+              <w:rPr>
+                <w:rFonts w:ascii="Times New Roman" w:hAnsi="Times New Roman"/>
+                <w:sz w:val="20"/>
+              </w:rPr>
+              <w:t>20</w:t>
+            </w:r>
+          </w:p>
+        </w:tc>
+      </w:tr>
+      <w:tr>
+        <w:tc>
+          <w:tcPr>
+            <w:tcW w:type="dxa" w:w="7654"/>
+          </w:tcPr>
+          <w:p>
+            <w:r/>
+            <w:r>
+              <w:rPr>
+                <w:rFonts w:ascii="Times New Roman" w:hAnsi="Times New Roman"/>
+                <w:sz w:val="20"/>
+              </w:rPr>
+              <w:t>Fig. A.3: Image summarization endpoint</w:t>
+            </w:r>
+          </w:p>
+        </w:tc>
+        <w:tc>
+          <w:tcPr>
+            <w:tcW w:type="dxa" w:w="1701"/>
+          </w:tcPr>
+          <w:p>
+            <w:r/>
+            <w:r>
+              <w:rPr>
+                <w:rFonts w:ascii="Times New Roman" w:hAnsi="Times New Roman"/>
+                <w:sz w:val="20"/>
+              </w:rPr>
+              <w:t>21</w:t>
+            </w:r>
+          </w:p>
+        </w:tc>
+      </w:tr>
+      <w:tr>
+        <w:tc>
+          <w:tcPr>
+            <w:tcW w:type="dxa" w:w="7654"/>
+          </w:tcPr>
+          <w:p>
+            <w:r/>
+            <w:r>
+              <w:rPr>
+                <w:rFonts w:ascii="Times New Roman" w:hAnsi="Times New Roman"/>
+                <w:sz w:val="20"/>
+              </w:rPr>
+              <w:t>Fig. A.4: Gemini vision client</w:t>
+            </w:r>
+          </w:p>
+        </w:tc>
+        <w:tc>
+          <w:tcPr>
+            <w:tcW w:type="dxa" w:w="1701"/>
+          </w:tcPr>
+          <w:p>
+            <w:r/>
+            <w:r>
+              <w:rPr>
+                <w:rFonts w:ascii="Times New Roman" w:hAnsi="Times New Roman"/>
+                <w:sz w:val="20"/>
+              </w:rPr>
+              <w:t>21</w:t>
             </w:r>
           </w:p>
         </w:tc>
@@ -8523,7 +8651,7 @@
           <w:i w:val="0"/>
           <w:sz w:val="24"/>
         </w:rPr>
-        <w:t>Short, relevant excerpts from the project source code are given below.</w:t>
+        <w:t>The screenshots below show the main code modules of the project.</w:t>
       </w:r>
     </w:p>
     <w:p>
@@ -8570,28 +8698,61 @@
           <w:i w:val="0"/>
           <w:sz w:val="24"/>
         </w:rPr>
-        <w:t>The summarize() function routes to Gemini when configured, otherwise it loads the language-specific model, tokenizes the input, applies the IndicBART format where required, and generates the summary with beam search.</w:t>
-      </w:r>
-    </w:p>
-    <w:p>
+        <w:t>The summarize() function routes to Gemini when configured; otherwise it loads the language-specific model, tokenizes the input, applies the IndicBART format where required, and generates the summary with beam search.</w:t>
+      </w:r>
+    </w:p>
+    <w:p>
+      <w:pPr>
+        <w:jc w:val="center"/>
+      </w:pPr>
+      <w:r>
+        <w:drawing>
+          <wp:inline xmlns:a="http://schemas.openxmlformats.org/drawingml/2006/main" xmlns:pic="http://schemas.openxmlformats.org/drawingml/2006/picture">
+            <wp:extent cx="5400000" cy="3370869"/>
+            <wp:docPr id="2" name="Picture 2"/>
+            <wp:cNvGraphicFramePr>
+              <a:graphicFrameLocks noChangeAspect="1"/>
+            </wp:cNvGraphicFramePr>
+            <a:graphic>
+              <a:graphicData uri="http://schemas.openxmlformats.org/drawingml/2006/picture">
+                <pic:pic>
+                  <pic:nvPicPr>
+                    <pic:cNvPr id="0" name="01_summarizer.png"/>
+                    <pic:cNvPicPr/>
+                  </pic:nvPicPr>
+                  <pic:blipFill>
+                    <a:blip r:embed="rId11"/>
+                    <a:stretch>
+                      <a:fillRect/>
+                    </a:stretch>
+                  </pic:blipFill>
+                  <pic:spPr>
+                    <a:xfrm>
+                      <a:off x="0" y="0"/>
+                      <a:ext cx="5400000" cy="3370869"/>
+                    </a:xfrm>
+                    <a:prstGeom prst="rect"/>
+                  </pic:spPr>
+                </pic:pic>
+              </a:graphicData>
+            </a:graphic>
+          </wp:inline>
+        </w:drawing>
+      </w:r>
+    </w:p>
+    <w:p>
+      <w:pPr>
+        <w:spacing w:before="0" w:after="120"/>
+        <w:jc w:val="center"/>
+      </w:pPr>
       <w:r>
         <w:rPr>
-          <w:rFonts w:ascii="Courier New" w:hAnsi="Courier New"/>
-          <w:sz w:val="18"/>
+          <w:rFonts w:ascii="Times New Roman" w:hAnsi="Times New Roman"/>
+          <w:b w:val="0"/>
+          <w:i/>
+          <w:sz w:val="20"/>
         </w:rPr>
-        <w:t>def summarize(text, language, max_length=None, min_length=None):</w:t>
-        <w:br/>
-        <w:t xml:space="preserve">    if SUMMARY_PROVIDER == "gemini":</w:t>
-        <w:br/>
-        <w:t xml:space="preserve">        return summarize_with_gemini(text, language, max_length, min_length)</w:t>
-        <w:br/>
-        <w:t xml:space="preserve">    tokenizer, model = _load_pipeline(language)</w:t>
-        <w:br/>
-        <w:t xml:space="preserve">    inputs = tokenizer(text, max_length=512, truncation=True, return_tensors="pt")</w:t>
-        <w:br/>
-        <w:t xml:space="preserve">    output = model.generate(**inputs, num_beams=4, max_length=128)</w:t>
-        <w:br/>
-        <w:t xml:space="preserve">    return _decode_clean(tokenizer, output[0].tolist())</w:t>
+        <w:t>Figure A.1: Summarization function (src/summarizer.py)</w:t>
       </w:r>
     </w:p>
     <w:p>
@@ -8642,18 +8803,57 @@
       </w:r>
     </w:p>
     <w:p>
+      <w:pPr>
+        <w:jc w:val="center"/>
+      </w:pPr>
+      <w:r>
+        <w:drawing>
+          <wp:inline xmlns:a="http://schemas.openxmlformats.org/drawingml/2006/main" xmlns:pic="http://schemas.openxmlformats.org/drawingml/2006/picture">
+            <wp:extent cx="5400000" cy="3610843"/>
+            <wp:docPr id="3" name="Picture 3"/>
+            <wp:cNvGraphicFramePr>
+              <a:graphicFrameLocks noChangeAspect="1"/>
+            </wp:cNvGraphicFramePr>
+            <a:graphic>
+              <a:graphicData uri="http://schemas.openxmlformats.org/drawingml/2006/picture">
+                <pic:pic>
+                  <pic:nvPicPr>
+                    <pic:cNvPr id="0" name="02_ocr.png"/>
+                    <pic:cNvPicPr/>
+                  </pic:nvPicPr>
+                  <pic:blipFill>
+                    <a:blip r:embed="rId12"/>
+                    <a:stretch>
+                      <a:fillRect/>
+                    </a:stretch>
+                  </pic:blipFill>
+                  <pic:spPr>
+                    <a:xfrm>
+                      <a:off x="0" y="0"/>
+                      <a:ext cx="5400000" cy="3610843"/>
+                    </a:xfrm>
+                    <a:prstGeom prst="rect"/>
+                  </pic:spPr>
+                </pic:pic>
+              </a:graphicData>
+            </a:graphic>
+          </wp:inline>
+        </w:drawing>
+      </w:r>
+    </w:p>
+    <w:p>
+      <w:pPr>
+        <w:spacing w:before="0" w:after="120"/>
+        <w:jc w:val="center"/>
+      </w:pPr>
       <w:r>
         <w:rPr>
-          <w:rFonts w:ascii="Courier New" w:hAnsi="Courier New"/>
-          <w:sz w:val="18"/>
+          <w:rFonts w:ascii="Times New Roman" w:hAnsi="Times New Roman"/>
+          <w:b w:val="0"/>
+          <w:i/>
+          <w:sz w:val="20"/>
         </w:rPr>
-        <w:t>def image_to_text_any(image=None, image_bytes=None, mime_type="image/png"):</w:t>
-        <w:br/>
-        <w:t xml:space="preserve">    if SUMMARY_PROVIDER == "gemini":</w:t>
-        <w:br/>
-        <w:t xml:space="preserve">        return extract_text_with_gemini(image_bytes, mime_type)</w:t>
-        <w:br/>
-        <w:t xml:space="preserve">    return image_to_text(Image.open(io.BytesIO(image_bytes)))</w:t>
+        <w:t>Figure A.2: OCR routing (src/ocr.py)</w:t>
       </w:r>
     </w:p>
     <w:p>
@@ -8688,22 +8888,142 @@
       </w:r>
     </w:p>
     <w:p>
+      <w:pPr>
+        <w:jc w:val="center"/>
+      </w:pPr>
+      <w:r>
+        <w:drawing>
+          <wp:inline xmlns:a="http://schemas.openxmlformats.org/drawingml/2006/main" xmlns:pic="http://schemas.openxmlformats.org/drawingml/2006/picture">
+            <wp:extent cx="5400000" cy="3408416"/>
+            <wp:docPr id="4" name="Picture 4"/>
+            <wp:cNvGraphicFramePr>
+              <a:graphicFrameLocks noChangeAspect="1"/>
+            </wp:cNvGraphicFramePr>
+            <a:graphic>
+              <a:graphicData uri="http://schemas.openxmlformats.org/drawingml/2006/picture">
+                <pic:pic>
+                  <pic:nvPicPr>
+                    <pic:cNvPr id="0" name="03_api.png"/>
+                    <pic:cNvPicPr/>
+                  </pic:nvPicPr>
+                  <pic:blipFill>
+                    <a:blip r:embed="rId13"/>
+                    <a:stretch>
+                      <a:fillRect/>
+                    </a:stretch>
+                  </pic:blipFill>
+                  <pic:spPr>
+                    <a:xfrm>
+                      <a:off x="0" y="0"/>
+                      <a:ext cx="5400000" cy="3408416"/>
+                    </a:xfrm>
+                    <a:prstGeom prst="rect"/>
+                  </pic:spPr>
+                </pic:pic>
+              </a:graphicData>
+            </a:graphic>
+          </wp:inline>
+        </w:drawing>
+      </w:r>
+    </w:p>
+    <w:p>
+      <w:pPr>
+        <w:spacing w:before="0" w:after="120"/>
+        <w:jc w:val="center"/>
+      </w:pPr>
       <w:r>
         <w:rPr>
-          <w:rFonts w:ascii="Courier New" w:hAnsi="Courier New"/>
-          <w:sz w:val="18"/>
+          <w:rFonts w:ascii="Times New Roman" w:hAnsi="Times New Roman"/>
+          <w:b w:val="0"/>
+          <w:i/>
+          <w:sz w:val="20"/>
         </w:rPr>
-        <w:t>@app.post("/api/ocr-summarize")</w:t>
-        <w:br/>
-        <w:t>async def ocr_summarize(file: UploadFile, language: str = Form("en")):</w:t>
-        <w:br/>
-        <w:t xml:space="preserve">    data = await file.read()</w:t>
-        <w:br/>
-        <w:t xml:space="preserve">    text = image_to_text_any(image_bytes=data, mime_type=file.content_type)</w:t>
-        <w:br/>
-        <w:t xml:space="preserve">    summary = summarize(text, language)</w:t>
-        <w:br/>
-        <w:t xml:space="preserve">    return {"summary": summary, "source_text": text}</w:t>
+        <w:t>Figure A.3: Image summarization endpoint (web/server.py)</w:t>
+      </w:r>
+    </w:p>
+    <w:p>
+      <w:pPr>
+        <w:pStyle w:val="BodyText"/>
+        <w:spacing w:before="120" w:after="40"/>
+        <w:jc w:val="left"/>
+      </w:pPr>
+      <w:r>
+        <w:rPr>
+          <w:rFonts w:ascii="Times New Roman" w:hAnsi="Times New Roman"/>
+          <w:b/>
+          <w:i w:val="0"/>
+          <w:sz w:val="24"/>
+        </w:rPr>
+        <w:t>A.4 Gemini Vision Client</w:t>
+      </w:r>
+    </w:p>
+    <w:p>
+      <w:pPr>
+        <w:spacing w:before="0" w:after="120"/>
+        <w:jc w:val="left"/>
+      </w:pPr>
+      <w:r>
+        <w:rPr>
+          <w:rFonts w:ascii="Times New Roman" w:hAnsi="Times New Roman"/>
+          <w:b w:val="0"/>
+          <w:i/>
+          <w:sz w:val="20"/>
+        </w:rPr>
+        <w:t>Source file: src/llm_api.py</w:t>
+      </w:r>
+    </w:p>
+    <w:p>
+      <w:pPr>
+        <w:jc w:val="center"/>
+      </w:pPr>
+      <w:r>
+        <w:drawing>
+          <wp:inline xmlns:a="http://schemas.openxmlformats.org/drawingml/2006/main" xmlns:pic="http://schemas.openxmlformats.org/drawingml/2006/picture">
+            <wp:extent cx="5400000" cy="2611957"/>
+            <wp:docPr id="5" name="Picture 5"/>
+            <wp:cNvGraphicFramePr>
+              <a:graphicFrameLocks noChangeAspect="1"/>
+            </wp:cNvGraphicFramePr>
+            <a:graphic>
+              <a:graphicData uri="http://schemas.openxmlformats.org/drawingml/2006/picture">
+                <pic:pic>
+                  <pic:nvPicPr>
+                    <pic:cNvPr id="0" name="04_gemini.png"/>
+                    <pic:cNvPicPr/>
+                  </pic:nvPicPr>
+                  <pic:blipFill>
+                    <a:blip r:embed="rId14"/>
+                    <a:stretch>
+                      <a:fillRect/>
+                    </a:stretch>
+                  </pic:blipFill>
+                  <pic:spPr>
+                    <a:xfrm>
+                      <a:off x="0" y="0"/>
+                      <a:ext cx="5400000" cy="2611957"/>
+                    </a:xfrm>
+                    <a:prstGeom prst="rect"/>
+                  </pic:spPr>
+                </pic:pic>
+              </a:graphicData>
+            </a:graphic>
+          </wp:inline>
+        </w:drawing>
+      </w:r>
+    </w:p>
+    <w:p>
+      <w:pPr>
+        <w:spacing w:before="0" w:after="120"/>
+        <w:jc w:val="center"/>
+      </w:pPr>
+      <w:r>
+        <w:rPr>
+          <w:rFonts w:ascii="Times New Roman" w:hAnsi="Times New Roman"/>
+          <w:b w:val="0"/>
+          <w:i/>
+          <w:sz w:val="20"/>
+        </w:rPr>
+        <w:t>Figure A.4: Gemini vision OCR client (src/llm_api.py)</w:t>
       </w:r>
     </w:p>
     <w:p>

</xml_diff>

<commit_message>
Add descriptions for the Appendix A code screenshots
</commit_message>
<xml_diff>
--- a/report/Mini_Project_Report_Multilingual_Summarizer.docx
+++ b/report/Mini_Project_Report_Multilingual_Summarizer.docx
@@ -8651,7 +8651,7 @@
           <w:i w:val="0"/>
           <w:sz w:val="24"/>
         </w:rPr>
-        <w:t>The screenshots below show the main code modules of the project.</w:t>
+        <w:t>This appendix presents the core code modules of the project as editor screenshots, followed by a short description of each.</w:t>
       </w:r>
     </w:p>
     <w:p>
@@ -8683,22 +8683,6 @@
           <w:sz w:val="20"/>
         </w:rPr>
         <w:t>Source file: src/summarizer.py</w:t>
-      </w:r>
-    </w:p>
-    <w:p>
-      <w:pPr>
-        <w:pStyle w:val="BodyText"/>
-        <w:spacing w:before="0" w:after="120"/>
-        <w:jc w:val="both"/>
-      </w:pPr>
-      <w:r>
-        <w:rPr>
-          <w:rFonts w:ascii="Times New Roman" w:hAnsi="Times New Roman"/>
-          <w:b w:val="0"/>
-          <w:i w:val="0"/>
-          <w:sz w:val="24"/>
-        </w:rPr>
-        <w:t>The summarize() function routes to Gemini when configured; otherwise it loads the language-specific model, tokenizes the input, applies the IndicBART format where required, and generates the summary with beam search.</w:t>
       </w:r>
     </w:p>
     <w:p>
@@ -8758,6 +8742,22 @@
     <w:p>
       <w:pPr>
         <w:pStyle w:val="BodyText"/>
+        <w:spacing w:before="0" w:after="120"/>
+        <w:jc w:val="both"/>
+      </w:pPr>
+      <w:r>
+        <w:rPr>
+          <w:rFonts w:ascii="Times New Roman" w:hAnsi="Times New Roman"/>
+          <w:b w:val="0"/>
+          <w:i w:val="0"/>
+          <w:sz w:val="24"/>
+        </w:rPr>
+        <w:t>Description: The summarize() function is the single entry point for every summarization request. It first checks the configured backend: when SUMMARY_PROVIDER is “gemini” it delegates to summarize_with_gemini() and returns the result. Otherwise, it loads the language-specific tokenizer and model, builds the generation settings (beam search, length limits, no-repeat n-grams), tokenizes and truncates the input, applies the IndicBART language-token format for Hindi, calls model.generate(), and decodes the output while stripping control tokens. The same function therefore serves both the FastAPI web application and the Streamlit demo.</w:t>
+      </w:r>
+    </w:p>
+    <w:p>
+      <w:pPr>
+        <w:pStyle w:val="BodyText"/>
         <w:spacing w:before="120" w:after="40"/>
         <w:jc w:val="left"/>
       </w:pPr>
@@ -8784,22 +8784,6 @@
           <w:sz w:val="20"/>
         </w:rPr>
         <w:t>Source file: src/ocr.py</w:t>
-      </w:r>
-    </w:p>
-    <w:p>
-      <w:pPr>
-        <w:pStyle w:val="BodyText"/>
-        <w:spacing w:before="0" w:after="120"/>
-        <w:jc w:val="both"/>
-      </w:pPr>
-      <w:r>
-        <w:rPr>
-          <w:rFonts w:ascii="Times New Roman" w:hAnsi="Times New Roman"/>
-          <w:b w:val="0"/>
-          <w:i w:val="0"/>
-          <w:sz w:val="24"/>
-        </w:rPr>
-        <w:t>image_to_text_any() uses Gemini vision in cloud mode and EasyOCR in local mode.</w:t>
       </w:r>
     </w:p>
     <w:p>
@@ -8859,6 +8843,22 @@
     <w:p>
       <w:pPr>
         <w:pStyle w:val="BodyText"/>
+        <w:spacing w:before="0" w:after="120"/>
+        <w:jc w:val="both"/>
+      </w:pPr>
+      <w:r>
+        <w:rPr>
+          <w:rFonts w:ascii="Times New Roman" w:hAnsi="Times New Roman"/>
+          <w:b w:val="0"/>
+          <w:i w:val="0"/>
+          <w:sz w:val="24"/>
+        </w:rPr>
+        <w:t>Description: image_to_text_any() abstracts over two OCR backends. In Gemini mode it forwards the raw image bytes to extract_text_with_gemini(), so no local OCR model is needed in the cloud deployment. In local mode it converts the bytes into a PIL image and calls image_to_text(), which runs EasyOCR for English and Hindi. This keeps the same UI code working in both the lightweight cloud build and the full local installation.</w:t>
+      </w:r>
+    </w:p>
+    <w:p>
+      <w:pPr>
+        <w:pStyle w:val="BodyText"/>
         <w:spacing w:before="120" w:after="40"/>
         <w:jc w:val="left"/>
       </w:pPr>
@@ -8869,7 +8869,7 @@
           <w:i w:val="0"/>
           <w:sz w:val="24"/>
         </w:rPr>
-        <w:t>A.3 FastAPI Image Endpoint</w:t>
+        <w:t>A.3 Image Summarization Endpoint</w:t>
       </w:r>
     </w:p>
     <w:p>
@@ -8944,6 +8944,22 @@
     <w:p>
       <w:pPr>
         <w:pStyle w:val="BodyText"/>
+        <w:spacing w:before="0" w:after="120"/>
+        <w:jc w:val="both"/>
+      </w:pPr>
+      <w:r>
+        <w:rPr>
+          <w:rFonts w:ascii="Times New Roman" w:hAnsi="Times New Roman"/>
+          <w:b w:val="0"/>
+          <w:i w:val="0"/>
+          <w:sz w:val="24"/>
+        </w:rPr>
+        <w:t>Description: The /api/ocr-summarize endpoint accepts a multipart image upload together with the target language and length limits. It validates the language, reads the image bytes, extracts the text with image_to_text_any(), rejects the request when no text is detected, and then summarizes the extracted text. The response returns both the summary and the OCR text so the frontend can display them.</w:t>
+      </w:r>
+    </w:p>
+    <w:p>
+      <w:pPr>
+        <w:pStyle w:val="BodyText"/>
         <w:spacing w:before="120" w:after="40"/>
         <w:jc w:val="left"/>
       </w:pPr>
@@ -9024,6 +9040,22 @@
           <w:sz w:val="20"/>
         </w:rPr>
         <w:t>Figure A.4: Gemini vision OCR client (src/llm_api.py)</w:t>
+      </w:r>
+    </w:p>
+    <w:p>
+      <w:pPr>
+        <w:pStyle w:val="BodyText"/>
+        <w:spacing w:before="0" w:after="120"/>
+        <w:jc w:val="both"/>
+      </w:pPr>
+      <w:r>
+        <w:rPr>
+          <w:rFonts w:ascii="Times New Roman" w:hAnsi="Times New Roman"/>
+          <w:b w:val="0"/>
+          <w:i w:val="0"/>
+          <w:sz w:val="24"/>
+        </w:rPr>
+        <w:t>Description: extract_text_with_gemini() implements OCR through Gemini's multimodal API. It builds an extraction prompt, base64-encodes the image, and sends it as inline image data with the correct MIME type. The shared _generate() helper posts the request to the Gemini REST endpoint and returns the recognized text, which is then passed to the summarization step.</w:t>
       </w:r>
     </w:p>
     <w:p>

</xml_diff>